<commit_message>
Add Lesson Plan Library add-on to business plan
New subsection under Product & Technology describing what's built
(per-school builder + AI-assist) vs. pending (cross-school library,
needs new shared infrastructure), plus the $12.00/teacher/yr add-on
line item in the pricing table, matching the schools deck.

Co-Authored-By: Claude Sonnet 5 <noreply@anthropic.com>
</commit_message>
<xml_diff>
--- a/marketing/business-plan/Smart-Assess-Ja-Business-Plan.docx
+++ b/marketing/business-plan/Smart-Assess-Ja-Business-Plan.docx
@@ -634,6 +634,33 @@
           <w:szCs w:val="21"/>
         </w:rPr>
         <w:t xml:space="preserve">Teachers use AI to polish question wording and import questions directly from a PDF exam paper. A live help assistant answers questions for visitors and logged-in users. An optional AI second opinion assists staff reviewing flagged essay responses for possible AI-assisted writing — always advisory, never a final determination. Every AI suggestion is reviewed by a human before it is used; AI never grades a student and never makes an integrity decision on its own. Estimated AI spend is US$15 to US$30 per school per year.</w:t>
+      </w:r>
+    </w:p>
+    <w:p>
+      <w:pPr>
+        <w:spacing w:after="100" w:before="260"/>
+      </w:pPr>
+      <w:r>
+        <w:rPr>
+          <w:b/>
+          <w:bCs/>
+          <w:color w:val="121815"/>
+          <w:sz w:val="22"/>
+          <w:szCs w:val="22"/>
+        </w:rPr>
+        <w:t xml:space="preserve">Lesson Plan Library (optional add-on)</w:t>
+      </w:r>
+    </w:p>
+    <w:p>
+      <w:pPr>
+        <w:spacing w:after="160"/>
+      </w:pPr>
+      <w:r>
+        <w:rPr>
+          <w:sz w:val="21"/>
+          <w:szCs w:val="21"/>
+        </w:rPr>
+        <w:t xml:space="preserve">Teachers build lesson plans using the Ministry of Education's own National Standards Curriculum “5E” template (Engage, Explore, Explain, Elaborate, Evaluate), with an AI-assist button that drafts the full lesson body from a subject, grade, and topic, using the same reviewed-by-a-human, advisory-only AI pattern as the rest of the platform. The per-school builder and AI-assist are built and verified today. A cross-school library, where teachers at different schools can browse and copy each other's published plans, is designed and scoped but not yet live — it requires a small piece of new shared infrastructure, kept deliberately separate from any school's student data, that is next in the build queue.</w:t>
       </w:r>
     </w:p>
     <w:p>
@@ -1559,6 +1586,201 @@
                 <w:szCs w:val="19"/>
               </w:rPr>
               <w:t xml:space="preserve">Protects margin below 125 students</w:t>
+            </w:r>
+          </w:p>
+        </w:tc>
+      </w:tr>
+    </w:tbl>
+    <w:p>
+      <w:pPr>
+        <w:spacing w:after="160"/>
+      </w:pPr>
+    </w:p>
+    <w:p>
+      <w:pPr>
+        <w:spacing w:after="100" w:before="260"/>
+      </w:pPr>
+      <w:r>
+        <w:rPr>
+          <w:b/>
+          <w:bCs/>
+          <w:color w:val="121815"/>
+          <w:sz w:val="22"/>
+          <w:szCs w:val="22"/>
+        </w:rPr>
+        <w:t xml:space="preserve">Optional add-ons</w:t>
+      </w:r>
+    </w:p>
+    <w:tbl>
+      <w:tblPr>
+        <w:tblW w:type="dxa" w:w="10080"/>
+        <w:tblBorders>
+          <w:top w:val="single" w:color="auto" w:sz="4"/>
+          <w:left w:val="single" w:color="auto" w:sz="4"/>
+          <w:bottom w:val="single" w:color="auto" w:sz="4"/>
+          <w:right w:val="single" w:color="auto" w:sz="4"/>
+          <w:insideH w:val="single" w:color="auto" w:sz="4"/>
+          <w:insideV w:val="single" w:color="auto" w:sz="4"/>
+        </w:tblBorders>
+      </w:tblPr>
+      <w:tblGrid>
+        <w:gridCol w:w="3360"/>
+        <w:gridCol w:w="3360"/>
+        <w:gridCol w:w="3360"/>
+      </w:tblGrid>
+      <w:tr>
+        <w:trPr>
+          <w:tblHeader/>
+        </w:trPr>
+        <w:tc>
+          <w:tcPr>
+            <w:tcW w:type="dxa" w:w="3360"/>
+            <w:shd w:fill="0F3D2E" w:val="clear"/>
+            <w:tcMar>
+              <w:top w:type="dxa" w:w="90"/>
+              <w:left w:type="dxa" w:w="120"/>
+              <w:bottom w:type="dxa" w:w="90"/>
+              <w:right w:type="dxa" w:w="120"/>
+            </w:tcMar>
+            <w:vAlign w:val="center"/>
+          </w:tcPr>
+          <w:p>
+            <w:r>
+              <w:rPr>
+                <w:b/>
+                <w:bCs/>
+                <w:caps/>
+                <w:color w:val="FFFFFF"/>
+                <w:spacing w:val="6"/>
+                <w:sz w:val="17"/>
+                <w:szCs w:val="17"/>
+              </w:rPr>
+              <w:t xml:space="preserve">Item</w:t>
+            </w:r>
+          </w:p>
+        </w:tc>
+        <w:tc>
+          <w:tcPr>
+            <w:tcW w:type="dxa" w:w="3360"/>
+            <w:shd w:fill="0F3D2E" w:val="clear"/>
+            <w:tcMar>
+              <w:top w:type="dxa" w:w="90"/>
+              <w:left w:type="dxa" w:w="120"/>
+              <w:bottom w:type="dxa" w:w="90"/>
+              <w:right w:type="dxa" w:w="120"/>
+            </w:tcMar>
+            <w:vAlign w:val="center"/>
+          </w:tcPr>
+          <w:p>
+            <w:r>
+              <w:rPr>
+                <w:b/>
+                <w:bCs/>
+                <w:caps/>
+                <w:color w:val="FFFFFF"/>
+                <w:spacing w:val="6"/>
+                <w:sz w:val="17"/>
+                <w:szCs w:val="17"/>
+              </w:rPr>
+              <w:t xml:space="preserve">Rate</w:t>
+            </w:r>
+          </w:p>
+        </w:tc>
+        <w:tc>
+          <w:tcPr>
+            <w:tcW w:type="dxa" w:w="3360"/>
+            <w:shd w:fill="0F3D2E" w:val="clear"/>
+            <w:tcMar>
+              <w:top w:type="dxa" w:w="90"/>
+              <w:left w:type="dxa" w:w="120"/>
+              <w:bottom w:type="dxa" w:w="90"/>
+              <w:right w:type="dxa" w:w="120"/>
+            </w:tcMar>
+            <w:vAlign w:val="center"/>
+          </w:tcPr>
+          <w:p>
+            <w:r>
+              <w:rPr>
+                <w:b/>
+                <w:bCs/>
+                <w:caps/>
+                <w:color w:val="FFFFFF"/>
+                <w:spacing w:val="6"/>
+                <w:sz w:val="17"/>
+                <w:szCs w:val="17"/>
+              </w:rPr>
+              <w:t xml:space="preserve">Notes</w:t>
+            </w:r>
+          </w:p>
+        </w:tc>
+      </w:tr>
+      <w:tr>
+        <w:tc>
+          <w:tcPr>
+            <w:tcW w:type="dxa" w:w="3360"/>
+            <w:shd w:fill="FFFFFF" w:val="clear"/>
+            <w:tcMar>
+              <w:top w:type="dxa" w:w="80"/>
+              <w:left w:type="dxa" w:w="120"/>
+              <w:bottom w:type="dxa" w:w="80"/>
+              <w:right w:type="dxa" w:w="120"/>
+            </w:tcMar>
+            <w:vAlign w:val="center"/>
+          </w:tcPr>
+          <w:p>
+            <w:r>
+              <w:rPr>
+                <w:color w:val="121815"/>
+                <w:sz w:val="19"/>
+                <w:szCs w:val="19"/>
+              </w:rPr>
+              <w:t xml:space="preserve">Lesson Plan Library</w:t>
+            </w:r>
+          </w:p>
+        </w:tc>
+        <w:tc>
+          <w:tcPr>
+            <w:tcW w:type="dxa" w:w="3360"/>
+            <w:shd w:fill="FFFFFF" w:val="clear"/>
+            <w:tcMar>
+              <w:top w:type="dxa" w:w="80"/>
+              <w:left w:type="dxa" w:w="120"/>
+              <w:bottom w:type="dxa" w:w="80"/>
+              <w:right w:type="dxa" w:w="120"/>
+            </w:tcMar>
+            <w:vAlign w:val="center"/>
+          </w:tcPr>
+          <w:p>
+            <w:r>
+              <w:rPr>
+                <w:color w:val="121815"/>
+                <w:sz w:val="19"/>
+                <w:szCs w:val="19"/>
+              </w:rPr>
+              <w:t xml:space="preserve">$12.00 / teacher / yr</w:t>
+            </w:r>
+          </w:p>
+        </w:tc>
+        <w:tc>
+          <w:tcPr>
+            <w:tcW w:type="dxa" w:w="3360"/>
+            <w:shd w:fill="FFFFFF" w:val="clear"/>
+            <w:tcMar>
+              <w:top w:type="dxa" w:w="80"/>
+              <w:left w:type="dxa" w:w="120"/>
+              <w:bottom w:type="dxa" w:w="80"/>
+              <w:right w:type="dxa" w:w="120"/>
+            </w:tcMar>
+            <w:vAlign w:val="center"/>
+          </w:tcPr>
+          <w:p>
+            <w:r>
+              <w:rPr>
+                <w:color w:val="121815"/>
+                <w:sz w:val="19"/>
+                <w:szCs w:val="19"/>
+              </w:rPr>
+              <w:t xml:space="preserve">AI-assisted, NSC-aligned lesson plans (proposed rate, pending confirmation)</w:t>
             </w:r>
           </w:p>
         </w:tc>

</xml_diff>

<commit_message>
Make Lesson Plan Library free and automatic, not a paid add-on
The feature now ships on by default for every school at no charge,
rather than requiring the owner to opt a school in per $12.00/teacher/yr.

- lessonPlanLibraryEnabled defaults to true (was false)
- Owner config page drops the pricing, labels it "included automatically"
- Both pitch decks: removed the priced add-on line, promoted it into the
  main AI-features section as a real included feature, and pulled it out
  of "Future roadmap" since it already shipped
- Business plan: rewrote the section to match (also fixes a stale claim
  that the cross-school library wasn't live yet -- it is)

Co-Authored-By: Claude Sonnet 5 <noreply@anthropic.com>
</commit_message>
<xml_diff>
--- a/marketing/business-plan/Smart-Assess-Ja-Business-Plan.docx
+++ b/marketing/business-plan/Smart-Assess-Ja-Business-Plan.docx
@@ -648,7 +648,7 @@
           <w:sz w:val="22"/>
           <w:szCs w:val="22"/>
         </w:rPr>
-        <w:t xml:space="preserve">Lesson Plan Library (optional add-on)</w:t>
+        <w:t xml:space="preserve">Lesson Plan Library</w:t>
       </w:r>
     </w:p>
     <w:p>
@@ -660,7 +660,7 @@
           <w:sz w:val="21"/>
           <w:szCs w:val="21"/>
         </w:rPr>
-        <w:t xml:space="preserve">Teachers build lesson plans using the Ministry of Education's own National Standards Curriculum “5E” template (Engage, Explore, Explain, Elaborate, Evaluate), with an AI-assist button that drafts the full lesson body from a subject, grade, and topic, using the same reviewed-by-a-human, advisory-only AI pattern as the rest of the platform. The per-school builder and AI-assist are built and verified today. A cross-school library, where teachers at different schools can browse and copy each other's published plans, is designed and scoped but not yet live — it requires a small piece of new shared infrastructure, kept deliberately separate from any school's student data, that is next in the build queue.</w:t>
+        <w:t xml:space="preserve">Teachers build lesson plans using the Ministry of Education's own National Standards Curriculum “5E” template (Engage, Explore, Explain, Elaborate, Evaluate), with an AI-assist button that drafts the full lesson body from a subject, grade, and topic, using the same reviewed-by-a-human, advisory-only AI pattern as the rest of the platform. Included automatically with every school at no additional charge. Both the per-school builder and a cross-school library, where teachers at different schools can browse and copy each other's published plans, are built and live today.</w:t>
       </w:r>
     </w:p>
     <w:p>
@@ -1596,196 +1596,6 @@
         <w:spacing w:after="160"/>
       </w:pPr>
     </w:p>
-    <w:p>
-      <w:pPr>
-        <w:spacing w:after="100" w:before="260"/>
-      </w:pPr>
-      <w:r>
-        <w:rPr>
-          <w:b/>
-          <w:bCs/>
-          <w:color w:val="121815"/>
-          <w:sz w:val="22"/>
-          <w:szCs w:val="22"/>
-        </w:rPr>
-        <w:t xml:space="preserve">Optional add-ons</w:t>
-      </w:r>
-    </w:p>
-    <w:tbl>
-      <w:tblPr>
-        <w:tblW w:type="dxa" w:w="10080"/>
-        <w:tblBorders>
-          <w:top w:val="single" w:color="auto" w:sz="4"/>
-          <w:left w:val="single" w:color="auto" w:sz="4"/>
-          <w:bottom w:val="single" w:color="auto" w:sz="4"/>
-          <w:right w:val="single" w:color="auto" w:sz="4"/>
-          <w:insideH w:val="single" w:color="auto" w:sz="4"/>
-          <w:insideV w:val="single" w:color="auto" w:sz="4"/>
-        </w:tblBorders>
-      </w:tblPr>
-      <w:tblGrid>
-        <w:gridCol w:w="3360"/>
-        <w:gridCol w:w="3360"/>
-        <w:gridCol w:w="3360"/>
-      </w:tblGrid>
-      <w:tr>
-        <w:trPr>
-          <w:tblHeader/>
-        </w:trPr>
-        <w:tc>
-          <w:tcPr>
-            <w:tcW w:type="dxa" w:w="3360"/>
-            <w:shd w:fill="0F3D2E" w:val="clear"/>
-            <w:tcMar>
-              <w:top w:type="dxa" w:w="90"/>
-              <w:left w:type="dxa" w:w="120"/>
-              <w:bottom w:type="dxa" w:w="90"/>
-              <w:right w:type="dxa" w:w="120"/>
-            </w:tcMar>
-            <w:vAlign w:val="center"/>
-          </w:tcPr>
-          <w:p>
-            <w:r>
-              <w:rPr>
-                <w:b/>
-                <w:bCs/>
-                <w:caps/>
-                <w:color w:val="FFFFFF"/>
-                <w:spacing w:val="6"/>
-                <w:sz w:val="17"/>
-                <w:szCs w:val="17"/>
-              </w:rPr>
-              <w:t xml:space="preserve">Item</w:t>
-            </w:r>
-          </w:p>
-        </w:tc>
-        <w:tc>
-          <w:tcPr>
-            <w:tcW w:type="dxa" w:w="3360"/>
-            <w:shd w:fill="0F3D2E" w:val="clear"/>
-            <w:tcMar>
-              <w:top w:type="dxa" w:w="90"/>
-              <w:left w:type="dxa" w:w="120"/>
-              <w:bottom w:type="dxa" w:w="90"/>
-              <w:right w:type="dxa" w:w="120"/>
-            </w:tcMar>
-            <w:vAlign w:val="center"/>
-          </w:tcPr>
-          <w:p>
-            <w:r>
-              <w:rPr>
-                <w:b/>
-                <w:bCs/>
-                <w:caps/>
-                <w:color w:val="FFFFFF"/>
-                <w:spacing w:val="6"/>
-                <w:sz w:val="17"/>
-                <w:szCs w:val="17"/>
-              </w:rPr>
-              <w:t xml:space="preserve">Rate</w:t>
-            </w:r>
-          </w:p>
-        </w:tc>
-        <w:tc>
-          <w:tcPr>
-            <w:tcW w:type="dxa" w:w="3360"/>
-            <w:shd w:fill="0F3D2E" w:val="clear"/>
-            <w:tcMar>
-              <w:top w:type="dxa" w:w="90"/>
-              <w:left w:type="dxa" w:w="120"/>
-              <w:bottom w:type="dxa" w:w="90"/>
-              <w:right w:type="dxa" w:w="120"/>
-            </w:tcMar>
-            <w:vAlign w:val="center"/>
-          </w:tcPr>
-          <w:p>
-            <w:r>
-              <w:rPr>
-                <w:b/>
-                <w:bCs/>
-                <w:caps/>
-                <w:color w:val="FFFFFF"/>
-                <w:spacing w:val="6"/>
-                <w:sz w:val="17"/>
-                <w:szCs w:val="17"/>
-              </w:rPr>
-              <w:t xml:space="preserve">Notes</w:t>
-            </w:r>
-          </w:p>
-        </w:tc>
-      </w:tr>
-      <w:tr>
-        <w:tc>
-          <w:tcPr>
-            <w:tcW w:type="dxa" w:w="3360"/>
-            <w:shd w:fill="FFFFFF" w:val="clear"/>
-            <w:tcMar>
-              <w:top w:type="dxa" w:w="80"/>
-              <w:left w:type="dxa" w:w="120"/>
-              <w:bottom w:type="dxa" w:w="80"/>
-              <w:right w:type="dxa" w:w="120"/>
-            </w:tcMar>
-            <w:vAlign w:val="center"/>
-          </w:tcPr>
-          <w:p>
-            <w:r>
-              <w:rPr>
-                <w:color w:val="121815"/>
-                <w:sz w:val="19"/>
-                <w:szCs w:val="19"/>
-              </w:rPr>
-              <w:t xml:space="preserve">Lesson Plan Library</w:t>
-            </w:r>
-          </w:p>
-        </w:tc>
-        <w:tc>
-          <w:tcPr>
-            <w:tcW w:type="dxa" w:w="3360"/>
-            <w:shd w:fill="FFFFFF" w:val="clear"/>
-            <w:tcMar>
-              <w:top w:type="dxa" w:w="80"/>
-              <w:left w:type="dxa" w:w="120"/>
-              <w:bottom w:type="dxa" w:w="80"/>
-              <w:right w:type="dxa" w:w="120"/>
-            </w:tcMar>
-            <w:vAlign w:val="center"/>
-          </w:tcPr>
-          <w:p>
-            <w:r>
-              <w:rPr>
-                <w:color w:val="121815"/>
-                <w:sz w:val="19"/>
-                <w:szCs w:val="19"/>
-              </w:rPr>
-              <w:t xml:space="preserve">$12.00 / teacher / yr</w:t>
-            </w:r>
-          </w:p>
-        </w:tc>
-        <w:tc>
-          <w:tcPr>
-            <w:tcW w:type="dxa" w:w="3360"/>
-            <w:shd w:fill="FFFFFF" w:val="clear"/>
-            <w:tcMar>
-              <w:top w:type="dxa" w:w="80"/>
-              <w:left w:type="dxa" w:w="120"/>
-              <w:bottom w:type="dxa" w:w="80"/>
-              <w:right w:type="dxa" w:w="120"/>
-            </w:tcMar>
-            <w:vAlign w:val="center"/>
-          </w:tcPr>
-          <w:p>
-            <w:r>
-              <w:rPr>
-                <w:color w:val="121815"/>
-                <w:sz w:val="19"/>
-                <w:szCs w:val="19"/>
-              </w:rPr>
-              <w:t xml:space="preserve">AI-assisted, NSC-aligned lesson plans (proposed rate, pending confirmation)</w:t>
-            </w:r>
-          </w:p>
-        </w:tc>
-      </w:tr>
-    </w:tbl>
     <w:p>
       <w:pPr>
         <w:spacing w:after="160"/>

</xml_diff>